<commit_message>
Align JEET package with current submission requirements
</commit_message>
<xml_diff>
--- a/submission/jeet/Cover_Letter_AUTHOR_INPUT_REQUIRED.docx
+++ b/submission/jeet/Cover_Letter_AUTHOR_INPUT_REQUIRED.docx
@@ -90,6 +90,15 @@
           <w:sz w:val="20"/>
         </w:rPr>
         <w:t>We submit the enclosed Original Article, "When Healthy-Only Transfer Fails: A Leakage-Resistant Cross-Dataset Evaluation of PMSM Stator-Fault Detectors under Compound Speed, Load, and Topology Shift", for consideration in Journal of Electrical Engineering &amp; Technology. The study addresses permanent-magnet machines, motor-drive monitoring, sensor signal processing, and practical industrial reliability, all within the journal's scope.</w:t>
+      </w:r>
+    </w:p>
+    <w:p>
+      <w:r>
+        <w:rPr>
+          <w:rFonts w:ascii="Times New Roman" w:hAnsi="Times New Roman" w:eastAsia="Times New Roman"/>
+          <w:sz w:val="20"/>
+        </w:rPr>
+        <w:t>The most directly relevant JEET categories are B - Electric Machinery and Power Electronics (Permanent Magnet Machines; Motor Drive and related applications) and I - Practical Industrial Electric Applications (Industrial Electric System Control Applications).</w:t>
       </w:r>
     </w:p>
     <w:p>

</xml_diff>